<commit_message>
docs: update final reports
Authors: RM556319 Felipe Marques de Oliveira | RM556309 Gabriel Barros Cisoto
</commit_message>
<xml_diff>
--- a/Relatório Técnico - Checkpoint 2 C#.docx
+++ b/Relatório Técnico - Checkpoint 2 C#.docx
@@ -227,27 +227,6 @@
     </w:p>
     <w:p>
       <w:pPr>
-        <w:rPr>
-          <w:b/>
-        </w:rPr>
-      </w:pPr>
-    </w:p>
-    <w:p>
-      <w:pPr>
-        <w:rPr>
-          <w:b/>
-        </w:rPr>
-      </w:pPr>
-    </w:p>
-    <w:p>
-      <w:pPr>
-        <w:rPr>
-          <w:b/>
-        </w:rPr>
-      </w:pPr>
-    </w:p>
-    <w:p>
-      <w:pPr>
         <w:ind w:left="0" w:firstLine="0"/>
         <w:rPr>
           <w:b/>
@@ -334,6 +313,42 @@
           <w:sz w:val="24"/>
         </w:rPr>
         <w:t>Identificação dos Integrantes</w:t>
+      </w:r>
+    </w:p>
+    <w:p>
+      <w:pPr>
+        <w:rPr>
+          <w:lang w:val="en-US"/>
+        </w:rPr>
+      </w:pPr>
+      <w:r>
+        <w:tab/>
+      </w:r>
+      <w:r>
+        <w:rPr>
+          <w:lang w:val="en-US"/>
+        </w:rPr>
+        <w:t xml:space="preserve">     </w:t>
+      </w:r>
+      <w:proofErr w:type="spellStart"/>
+      <w:r>
+        <w:rPr>
+          <w:lang w:val="en-US"/>
+        </w:rPr>
+        <w:t>Github</w:t>
+      </w:r>
+      <w:proofErr w:type="spellEnd"/>
+      <w:r>
+        <w:rPr>
+          <w:lang w:val="en-US"/>
+        </w:rPr>
+        <w:t xml:space="preserve"> Link: </w:t>
+      </w:r>
+      <w:r>
+        <w:rPr>
+          <w:lang w:val="en-US"/>
+        </w:rPr>
+        <w:t>https://github.com/FelipeMarquesdeOliveira/CP2-CSharp.git</w:t>
       </w:r>
     </w:p>
     <w:p>

</xml_diff>